<commit_message>
docs: fill architecture diagram (Rys. 1) and add final demo PDF
Generate the system-context architecture diagram from docs/architecture.md and
place it into the last remaining figure slot (Rys. 1), so the walkthrough has
no empty placeholders left. Add the exported, ready-to-share Factory-Telemetry-
Demo.pdf in the repo root.

Co-Authored-By: Claude Opus 4.8 <noreply@anthropic.com>
</commit_message>
<xml_diff>
--- a/docs/Factory-Telemetry-Demo.docx
+++ b/docs/Factory-Telemetry-Demo.docx
@@ -342,27 +342,41 @@
               <w:jc w:val="center"/>
             </w:pPr>
             <w:r>
-              <w:rPr>
-                <w:b/>
-                <w:bCs/>
-                <w:color w:val="808080"/>
-              </w:rPr>
-              <w:t>[ MIEJSCE NA ZRZUT EKRANU ]</w:t>
-            </w:r>
-          </w:p>
-          <w:p>
-            <w:pPr>
-              <w:jc w:val="center"/>
-            </w:pPr>
-            <w:r>
-              <w:rPr>
-                <w:i/>
-                <w:iCs/>
-                <w:color w:val="808080"/>
-                <w:sz w:val="18"/>
-                <w:szCs w:val="18"/>
-              </w:rPr>
-              <w:t>Rys. 1 — Diagram architektury (z pliku docs/architecture.md)</w:t>
+              <w:drawing xmlns:a="http://schemas.openxmlformats.org/drawingml/2006/main" xmlns:pic="http://schemas.openxmlformats.org/drawingml/2006/picture">
+                <wp:inline distT="0" distB="0" distL="0" distR="0">
+                  <wp:extent cx="5400000" cy="2896364"/>
+                  <wp:effectExtent l="0" t="0" r="0" b="0"/>
+                  <wp:docPr id="900001" name="Architektura systemu"/>
+                  <wp:cNvGraphicFramePr>
+                    <a:graphicFrameLocks noChangeAspect="1"/>
+                  </wp:cNvGraphicFramePr>
+                  <a:graphic>
+                    <a:graphicData uri="http://schemas.openxmlformats.org/drawingml/2006/picture">
+                      <pic:pic>
+                        <pic:nvPicPr>
+                          <pic:cNvPr id="900001" name="architecture.png"/>
+                          <pic:cNvPicPr/>
+                        </pic:nvPicPr>
+                        <pic:blipFill>
+                          <a:blip r:embed="rId22"/>
+                          <a:stretch>
+                            <a:fillRect/>
+                          </a:stretch>
+                        </pic:blipFill>
+                        <pic:spPr>
+                          <a:xfrm>
+                            <a:off x="0" y="0"/>
+                            <a:ext cx="5400000" cy="2896364"/>
+                          </a:xfrm>
+                          <a:prstGeom prst="rect">
+                            <a:avLst/>
+                          </a:prstGeom>
+                        </pic:spPr>
+                      </pic:pic>
+                    </a:graphicData>
+                  </a:graphic>
+                </wp:inline>
+              </w:drawing>
             </w:r>
           </w:p>
         </w:tc>

</xml_diff>